<commit_message>
update to swe resume
</commit_message>
<xml_diff>
--- a/SWE/JashThakkarResume.docx
+++ b/SWE/JashThakkarResume.docx
@@ -1397,6 +1397,17 @@
           <w:sz w:val="16"/>
           <w:szCs w:val="16"/>
         </w:rPr>
+        <w:t>)</w:t>
+      </w:r>
+      <w:r>
+        <w:rPr>
+          <w:rFonts w:ascii="Times New Roman" w:hAnsi="Times New Roman" w:cs="Times New Roman"/>
+          <w:b/>
+          <w:bCs/>
+          <w:color w:val="000000" w:themeColor="text1"/>
+          <w:sz w:val="16"/>
+          <w:szCs w:val="16"/>
+        </w:rPr>
         <w:t xml:space="preserve"> </w:t>
       </w:r>
     </w:p>
@@ -1800,7 +1811,29 @@
           <w:sz w:val="16"/>
           <w:szCs w:val="16"/>
         </w:rPr>
-        <w:t xml:space="preserve"> (HTML, CSS, JavaScript, PHP, MySQL)</w:t>
+        <w:t xml:space="preserve"> (HTML, CSS, JavaScript, PHP,</w:t>
+      </w:r>
+      <w:r>
+        <w:rPr>
+          <w:rFonts w:ascii="Times New Roman" w:hAnsi="Times New Roman" w:cs="Times New Roman"/>
+          <w:b/>
+          <w:bCs/>
+          <w:color w:val="000000" w:themeColor="text1"/>
+          <w:sz w:val="16"/>
+          <w:szCs w:val="16"/>
+        </w:rPr>
+        <w:t xml:space="preserve"> </w:t>
+      </w:r>
+      <w:r>
+        <w:rPr>
+          <w:rFonts w:ascii="Times New Roman" w:hAnsi="Times New Roman" w:cs="Times New Roman"/>
+          <w:b/>
+          <w:bCs/>
+          <w:color w:val="000000" w:themeColor="text1"/>
+          <w:sz w:val="16"/>
+          <w:szCs w:val="16"/>
+        </w:rPr>
+        <w:t>MySQL)</w:t>
       </w:r>
     </w:p>
     <w:p>
@@ -2083,7 +2116,7 @@
             <w:sz w:val="16"/>
             <w:szCs w:val="16"/>
           </w:rPr>
-          <w:t>ML Debug Assist</w:t>
+          <w:t>Traffic Sign Image Recognition System</w:t>
         </w:r>
       </w:hyperlink>
       <w:r>
@@ -2095,8 +2128,9 @@
           <w:sz w:val="16"/>
           <w:szCs w:val="16"/>
         </w:rPr>
-        <w:t xml:space="preserve"> (Python, scikit</w:t>
-      </w:r>
+        <w:t xml:space="preserve"> (Python, </w:t>
+      </w:r>
+      <w:proofErr w:type="spellStart"/>
       <w:r>
         <w:rPr>
           <w:rFonts w:ascii="Times New Roman" w:hAnsi="Times New Roman" w:cs="Times New Roman"/>
@@ -2106,8 +2140,9 @@
           <w:sz w:val="16"/>
           <w:szCs w:val="16"/>
         </w:rPr>
-        <w:t xml:space="preserve"> </w:t>
-      </w:r>
+        <w:t>PyTorch</w:t>
+      </w:r>
+      <w:proofErr w:type="spellEnd"/>
       <w:r>
         <w:rPr>
           <w:rFonts w:ascii="Times New Roman" w:hAnsi="Times New Roman" w:cs="Times New Roman"/>
@@ -2117,8 +2152,9 @@
           <w:sz w:val="16"/>
           <w:szCs w:val="16"/>
         </w:rPr>
-        <w:t>learn,</w:t>
-      </w:r>
+        <w:t xml:space="preserve">, scikit-learn, OpenCV, Pandas, NumPy, </w:t>
+      </w:r>
+      <w:proofErr w:type="spellStart"/>
       <w:r>
         <w:rPr>
           <w:rFonts w:ascii="Times New Roman" w:hAnsi="Times New Roman" w:cs="Times New Roman"/>
@@ -2128,8 +2164,9 @@
           <w:sz w:val="16"/>
           <w:szCs w:val="16"/>
         </w:rPr>
-        <w:t xml:space="preserve"> </w:t>
-      </w:r>
+        <w:t>Torchvision</w:t>
+      </w:r>
+      <w:proofErr w:type="spellEnd"/>
       <w:r>
         <w:rPr>
           <w:rFonts w:ascii="Times New Roman" w:hAnsi="Times New Roman" w:cs="Times New Roman"/>
@@ -2139,29 +2176,7 @@
           <w:sz w:val="16"/>
           <w:szCs w:val="16"/>
         </w:rPr>
-        <w:t>YAML, CLI</w:t>
-      </w:r>
-      <w:r>
-        <w:rPr>
-          <w:rFonts w:ascii="Times New Roman" w:hAnsi="Times New Roman" w:cs="Times New Roman"/>
-          <w:b/>
-          <w:bCs/>
-          <w:color w:val="000000" w:themeColor="text1"/>
-          <w:sz w:val="16"/>
-          <w:szCs w:val="16"/>
-        </w:rPr>
-        <w:t>, TF-IDF</w:t>
-      </w:r>
-      <w:r>
-        <w:rPr>
-          <w:rFonts w:ascii="Times New Roman" w:hAnsi="Times New Roman" w:cs="Times New Roman"/>
-          <w:b/>
-          <w:bCs/>
-          <w:color w:val="000000" w:themeColor="text1"/>
-          <w:sz w:val="16"/>
-          <w:szCs w:val="16"/>
-        </w:rPr>
-        <w:t>)</w:t>
+        <w:t xml:space="preserve">, Matplotlib) </w:t>
       </w:r>
     </w:p>
     <w:p>
@@ -2170,7 +2185,7 @@
         <w:widowControl w:val="0"/>
         <w:numPr>
           <w:ilvl w:val="0"/>
-          <w:numId w:val="46"/>
+          <w:numId w:val="40"/>
         </w:numPr>
         <w:spacing w:after="0" w:line="240" w:lineRule="auto"/>
         <w:rPr>
@@ -2187,7 +2202,47 @@
           <w:sz w:val="16"/>
           <w:szCs w:val="16"/>
         </w:rPr>
-        <w:t>Designed and built a fully local ML-powered debugging assistant that classifies Python runtime errors using a hybrid rule-based and machine-learning approach to generate structured troubleshooting guidance.</w:t>
+        <w:t xml:space="preserve">Built an image recognition and classification models for </w:t>
+      </w:r>
+      <w:r>
+        <w:rPr>
+          <w:rFonts w:ascii="Times New Roman" w:hAnsi="Times New Roman" w:cs="Times New Roman"/>
+          <w:b/>
+          <w:bCs/>
+          <w:color w:val="000000" w:themeColor="text1"/>
+          <w:sz w:val="16"/>
+          <w:szCs w:val="16"/>
+        </w:rPr>
+        <w:t>43</w:t>
+      </w:r>
+      <w:r>
+        <w:rPr>
+          <w:rFonts w:ascii="Times New Roman" w:hAnsi="Times New Roman" w:cs="Times New Roman"/>
+          <w:color w:val="000000" w:themeColor="text1"/>
+          <w:sz w:val="16"/>
+          <w:szCs w:val="16"/>
+        </w:rPr>
+        <w:t xml:space="preserve"> traffic sign classes using the </w:t>
+      </w:r>
+      <w:r>
+        <w:rPr>
+          <w:rFonts w:ascii="Times New Roman" w:hAnsi="Times New Roman" w:cs="Times New Roman"/>
+          <w:b/>
+          <w:bCs/>
+          <w:color w:val="000000" w:themeColor="text1"/>
+          <w:sz w:val="16"/>
+          <w:szCs w:val="16"/>
+        </w:rPr>
+        <w:t>GTSRB</w:t>
+      </w:r>
+      <w:r>
+        <w:rPr>
+          <w:rFonts w:ascii="Times New Roman" w:hAnsi="Times New Roman" w:cs="Times New Roman"/>
+          <w:color w:val="000000" w:themeColor="text1"/>
+          <w:sz w:val="16"/>
+          <w:szCs w:val="16"/>
+        </w:rPr>
+        <w:t xml:space="preserve"> dataset, training, evaluating, and optimizing multiple machine learning models.</w:t>
       </w:r>
     </w:p>
     <w:p>
@@ -2196,7 +2251,7 @@
         <w:widowControl w:val="0"/>
         <w:numPr>
           <w:ilvl w:val="0"/>
-          <w:numId w:val="46"/>
+          <w:numId w:val="40"/>
         </w:numPr>
         <w:spacing w:after="0" w:line="240" w:lineRule="auto"/>
         <w:rPr>
@@ -2213,7 +2268,87 @@
           <w:sz w:val="16"/>
           <w:szCs w:val="16"/>
         </w:rPr>
-        <w:t>Implemented an end-to-end pipeline covering synthetic dataset generation, text preprocessing, TF-IDF feature extraction, and multiclass Logistic Regression training.</w:t>
+        <w:t xml:space="preserve">Developed a </w:t>
+      </w:r>
+      <w:r>
+        <w:rPr>
+          <w:rFonts w:ascii="Times New Roman" w:hAnsi="Times New Roman" w:cs="Times New Roman"/>
+          <w:b/>
+          <w:bCs/>
+          <w:color w:val="000000" w:themeColor="text1"/>
+          <w:sz w:val="16"/>
+          <w:szCs w:val="16"/>
+        </w:rPr>
+        <w:t>Neural Network</w:t>
+      </w:r>
+      <w:r>
+        <w:rPr>
+          <w:rFonts w:ascii="Times New Roman" w:hAnsi="Times New Roman" w:cs="Times New Roman"/>
+          <w:color w:val="000000" w:themeColor="text1"/>
+          <w:sz w:val="16"/>
+          <w:szCs w:val="16"/>
+        </w:rPr>
+        <w:t xml:space="preserve"> using </w:t>
+      </w:r>
+      <w:r>
+        <w:rPr>
+          <w:rFonts w:ascii="Times New Roman" w:hAnsi="Times New Roman" w:cs="Times New Roman"/>
+          <w:b/>
+          <w:bCs/>
+          <w:color w:val="000000" w:themeColor="text1"/>
+          <w:sz w:val="16"/>
+          <w:szCs w:val="16"/>
+        </w:rPr>
+        <w:t>ResNet18</w:t>
+      </w:r>
+      <w:r>
+        <w:rPr>
+          <w:rFonts w:ascii="Times New Roman" w:hAnsi="Times New Roman" w:cs="Times New Roman"/>
+          <w:color w:val="000000" w:themeColor="text1"/>
+          <w:sz w:val="16"/>
+          <w:szCs w:val="16"/>
+        </w:rPr>
+        <w:t xml:space="preserve"> and </w:t>
+      </w:r>
+      <w:r>
+        <w:rPr>
+          <w:rFonts w:ascii="Times New Roman" w:hAnsi="Times New Roman" w:cs="Times New Roman"/>
+          <w:b/>
+          <w:bCs/>
+          <w:color w:val="000000" w:themeColor="text1"/>
+          <w:sz w:val="16"/>
+          <w:szCs w:val="16"/>
+        </w:rPr>
+        <w:t>Transfer Learning</w:t>
+      </w:r>
+      <w:r>
+        <w:rPr>
+          <w:rFonts w:ascii="Times New Roman" w:hAnsi="Times New Roman" w:cs="Times New Roman"/>
+          <w:color w:val="000000" w:themeColor="text1"/>
+          <w:sz w:val="16"/>
+          <w:szCs w:val="16"/>
+        </w:rPr>
+        <w:t xml:space="preserve"> achieving up to a </w:t>
+      </w:r>
+      <w:r>
+        <w:rPr>
+          <w:rFonts w:ascii="Times New Roman" w:hAnsi="Times New Roman" w:cs="Times New Roman"/>
+          <w:b/>
+          <w:bCs/>
+          <w:color w:val="000000" w:themeColor="text1"/>
+          <w:sz w:val="16"/>
+          <w:szCs w:val="16"/>
+        </w:rPr>
+        <w:t>94%</w:t>
+      </w:r>
+      <w:r>
+        <w:rPr>
+          <w:rFonts w:ascii="Times New Roman" w:hAnsi="Times New Roman" w:cs="Times New Roman"/>
+          <w:color w:val="000000" w:themeColor="text1"/>
+          <w:sz w:val="16"/>
+          <w:szCs w:val="16"/>
+        </w:rPr>
+        <w:t xml:space="preserve"> test accuracy through stage-based training, and fine tuning.</w:t>
       </w:r>
     </w:p>
     <w:p>
@@ -2222,7 +2357,7 @@
         <w:widowControl w:val="0"/>
         <w:numPr>
           <w:ilvl w:val="0"/>
-          <w:numId w:val="46"/>
+          <w:numId w:val="40"/>
         </w:numPr>
         <w:spacing w:after="0" w:line="240" w:lineRule="auto"/>
         <w:rPr>
@@ -2239,7 +2374,58 @@
           <w:sz w:val="16"/>
           <w:szCs w:val="16"/>
         </w:rPr>
-        <w:t>Added confidence-aware inference logic to dynamically adjust output, surfacing multiple candidate error categories and prompting for additional context when predictions were uncertain.</w:t>
+        <w:t xml:space="preserve">Implemented multiple baseline models including HOG + SVC, k-NN, and Random Forest models, and through hyperparameter tuning was able to improve model test accuracies from as low as </w:t>
+      </w:r>
+      <w:r>
+        <w:rPr>
+          <w:rFonts w:ascii="Times New Roman" w:hAnsi="Times New Roman" w:cs="Times New Roman"/>
+          <w:b/>
+          <w:bCs/>
+          <w:color w:val="000000" w:themeColor="text1"/>
+          <w:sz w:val="16"/>
+          <w:szCs w:val="16"/>
+        </w:rPr>
+        <w:t>77%</w:t>
+      </w:r>
+      <w:r>
+        <w:rPr>
+          <w:rFonts w:ascii="Times New Roman" w:hAnsi="Times New Roman" w:cs="Times New Roman"/>
+          <w:color w:val="000000" w:themeColor="text1"/>
+          <w:sz w:val="16"/>
+          <w:szCs w:val="16"/>
+        </w:rPr>
+        <w:t xml:space="preserve"> to as high as </w:t>
+      </w:r>
+      <w:r>
+        <w:rPr>
+          <w:rFonts w:ascii="Times New Roman" w:hAnsi="Times New Roman" w:cs="Times New Roman"/>
+          <w:b/>
+          <w:bCs/>
+          <w:color w:val="000000" w:themeColor="text1"/>
+          <w:sz w:val="16"/>
+          <w:szCs w:val="16"/>
+        </w:rPr>
+        <w:t>97%</w:t>
+      </w:r>
+      <w:r>
+        <w:rPr>
+          <w:rFonts w:ascii="Times New Roman" w:hAnsi="Times New Roman" w:cs="Times New Roman"/>
+          <w:color w:val="000000" w:themeColor="text1"/>
+          <w:sz w:val="16"/>
+          <w:szCs w:val="16"/>
+        </w:rPr>
+        <w:t xml:space="preserve"> improving overall model accuracies by </w:t>
+      </w:r>
+      <w:r>
+        <w:rPr>
+          <w:rFonts w:ascii="Times New Roman" w:hAnsi="Times New Roman" w:cs="Times New Roman"/>
+          <w:b/>
+          <w:bCs/>
+          <w:color w:val="000000" w:themeColor="text1"/>
+          <w:sz w:val="16"/>
+          <w:szCs w:val="16"/>
+        </w:rPr>
+        <w:t>10%-20%.</w:t>
       </w:r>
     </w:p>
     <w:p>
@@ -2248,7 +2434,7 @@
         <w:widowControl w:val="0"/>
         <w:numPr>
           <w:ilvl w:val="0"/>
-          <w:numId w:val="46"/>
+          <w:numId w:val="40"/>
         </w:numPr>
         <w:spacing w:after="0" w:line="240" w:lineRule="auto"/>
         <w:rPr>
@@ -2265,7 +2451,53 @@
           <w:sz w:val="16"/>
           <w:szCs w:val="16"/>
         </w:rPr>
-        <w:t>Developed YAML-driven fix playbooks with similarity-based retrieval to deliver actionable debugging checklists and contextual examples, enabling reproducible, offline execution via a CLI.</w:t>
+        <w:t xml:space="preserve">Evaluated models based statistical analysis using precision, recall, F1-score, and </w:t>
+      </w:r>
+      <w:proofErr w:type="spellStart"/>
+      <w:r>
+        <w:rPr>
+          <w:rFonts w:ascii="Times New Roman" w:hAnsi="Times New Roman" w:cs="Times New Roman"/>
+          <w:color w:val="000000" w:themeColor="text1"/>
+          <w:sz w:val="16"/>
+          <w:szCs w:val="16"/>
+        </w:rPr>
+        <w:t>matplot</w:t>
+      </w:r>
+      <w:proofErr w:type="spellEnd"/>
+      <w:r>
+        <w:rPr>
+          <w:rFonts w:ascii="Times New Roman" w:hAnsi="Times New Roman" w:cs="Times New Roman"/>
+          <w:color w:val="000000" w:themeColor="text1"/>
+          <w:sz w:val="16"/>
+          <w:szCs w:val="16"/>
+        </w:rPr>
+        <w:t xml:space="preserve"> for confusion matrices visualization to analyze class level errors to better tailor optimizations and improve accuracies</w:t>
+      </w:r>
+    </w:p>
+    <w:p>
+      <w:pPr>
+        <w:pStyle w:val="ListParagraph"/>
+        <w:widowControl w:val="0"/>
+        <w:numPr>
+          <w:ilvl w:val="0"/>
+          <w:numId w:val="40"/>
+        </w:numPr>
+        <w:spacing w:after="0" w:line="240" w:lineRule="auto"/>
+        <w:rPr>
+          <w:rFonts w:ascii="Times New Roman" w:hAnsi="Times New Roman" w:cs="Times New Roman"/>
+          <w:color w:val="000000" w:themeColor="text1"/>
+          <w:sz w:val="16"/>
+          <w:szCs w:val="16"/>
+        </w:rPr>
+      </w:pPr>
+      <w:r>
+        <w:rPr>
+          <w:rFonts w:ascii="Times New Roman" w:hAnsi="Times New Roman" w:cs="Times New Roman"/>
+          <w:color w:val="000000" w:themeColor="text1"/>
+          <w:sz w:val="16"/>
+          <w:szCs w:val="16"/>
+        </w:rPr>
+        <w:t>Engineered data preprocessing and augmentation pipelines, including normalization and standardization of the image features.</w:t>
       </w:r>
     </w:p>
     <w:p>

</xml_diff>